<commit_message>
Update quiz questions and Word document
Made-with: Cursor
</commit_message>
<xml_diff>
--- a/Quiz Questions.docx
+++ b/Quiz Questions.docx
@@ -38,22 +38,6 @@
           <w:sz w:val="20"/>
           <w:szCs w:val="20"/>
         </w:rPr>
-        <w:t>1</w:t>
-      </w:r>
-      <w:r>
-        <w:rPr>
-          <w:rFonts w:ascii="Comic Sans MS" w:hAnsi="Comic Sans MS" w:cs="Dreaming Outloud Pro"/>
-          <w:sz w:val="20"/>
-          <w:szCs w:val="20"/>
-        </w:rPr>
-        <w:t xml:space="preserve"> </w:t>
-      </w:r>
-      <w:r>
-        <w:rPr>
-          <w:rFonts w:ascii="Comic Sans MS" w:hAnsi="Comic Sans MS" w:cs="Dreaming Outloud Pro"/>
-          <w:sz w:val="20"/>
-          <w:szCs w:val="20"/>
-        </w:rPr>
         <w:t xml:space="preserve">WHICH CRAFT BEER FIRM WENT INTO ADMINISTRATION ON MONDAY, MAKING </w:t>
       </w:r>
       <w:r>
@@ -81,14 +65,6 @@
           <w:sz w:val="20"/>
           <w:szCs w:val="20"/>
         </w:rPr>
-        <w:t xml:space="preserve">2 </w:t>
-      </w:r>
-      <w:r>
-        <w:rPr>
-          <w:rFonts w:ascii="Comic Sans MS" w:hAnsi="Comic Sans MS" w:cs="Dreaming Outloud Pro"/>
-          <w:sz w:val="20"/>
-          <w:szCs w:val="20"/>
-        </w:rPr>
         <w:t>WHICH</w:t>
       </w:r>
       <w:r>
@@ -172,14 +148,6 @@
           <w:sz w:val="20"/>
           <w:szCs w:val="20"/>
         </w:rPr>
-        <w:t xml:space="preserve">3 </w:t>
-      </w:r>
-      <w:r>
-        <w:rPr>
-          <w:rFonts w:ascii="Comic Sans MS" w:hAnsi="Comic Sans MS" w:cs="Dreaming Outloud Pro"/>
-          <w:sz w:val="20"/>
-          <w:szCs w:val="20"/>
-        </w:rPr>
         <w:t xml:space="preserve">NETFLIX MOVIE “THE IMMORTAL MAN” </w:t>
       </w:r>
       <w:r>
@@ -223,14 +191,6 @@
           <w:sz w:val="20"/>
           <w:szCs w:val="20"/>
         </w:rPr>
-        <w:t xml:space="preserve">4 </w:t>
-      </w:r>
-      <w:r>
-        <w:rPr>
-          <w:rFonts w:ascii="Comic Sans MS" w:hAnsi="Comic Sans MS" w:cs="Dreaming Outloud Pro"/>
-          <w:sz w:val="20"/>
-          <w:szCs w:val="20"/>
-        </w:rPr>
         <w:t xml:space="preserve">WHAT IS THE NAME OF THE </w:t>
       </w:r>
       <w:r>
@@ -314,14 +274,6 @@
           <w:sz w:val="20"/>
           <w:szCs w:val="20"/>
         </w:rPr>
-        <w:t xml:space="preserve">5 </w:t>
-      </w:r>
-      <w:r>
-        <w:rPr>
-          <w:rFonts w:ascii="Comic Sans MS" w:hAnsi="Comic Sans MS" w:cs="Dreaming Outloud Pro"/>
-          <w:sz w:val="20"/>
-          <w:szCs w:val="20"/>
-        </w:rPr>
         <w:t>WHICH SPORTS TROPHY</w:t>
       </w:r>
       <w:r>
@@ -421,22 +373,6 @@
           <w:sz w:val="20"/>
           <w:szCs w:val="20"/>
         </w:rPr>
-        <w:t>6</w:t>
-      </w:r>
-      <w:r>
-        <w:rPr>
-          <w:rFonts w:ascii="Comic Sans MS" w:hAnsi="Comic Sans MS" w:cs="Dreaming Outloud Pro"/>
-          <w:sz w:val="20"/>
-          <w:szCs w:val="20"/>
-        </w:rPr>
-        <w:t xml:space="preserve"> </w:t>
-      </w:r>
-      <w:r>
-        <w:rPr>
-          <w:rFonts w:ascii="Comic Sans MS" w:hAnsi="Comic Sans MS" w:cs="Dreaming Outloud Pro"/>
-          <w:sz w:val="20"/>
-          <w:szCs w:val="20"/>
-        </w:rPr>
         <w:t xml:space="preserve">WHICH MANUFACTURER </w:t>
       </w:r>
       <w:r>
@@ -480,22 +416,6 @@
           <w:sz w:val="20"/>
           <w:szCs w:val="20"/>
         </w:rPr>
-        <w:t>7</w:t>
-      </w:r>
-      <w:r>
-        <w:rPr>
-          <w:rFonts w:ascii="Comic Sans MS" w:hAnsi="Comic Sans MS" w:cs="Dreaming Outloud Pro"/>
-          <w:sz w:val="20"/>
-          <w:szCs w:val="20"/>
-        </w:rPr>
-        <w:t xml:space="preserve"> </w:t>
-      </w:r>
-      <w:r>
-        <w:rPr>
-          <w:rFonts w:ascii="Comic Sans MS" w:hAnsi="Comic Sans MS" w:cs="Dreaming Outloud Pro"/>
-          <w:sz w:val="20"/>
-          <w:szCs w:val="20"/>
-        </w:rPr>
         <w:t xml:space="preserve">WHICH BRITISH HISTORICAL FIGURE DID </w:t>
       </w:r>
       <w:r>
@@ -539,22 +459,6 @@
           <w:sz w:val="20"/>
           <w:szCs w:val="20"/>
         </w:rPr>
-        <w:t>8</w:t>
-      </w:r>
-      <w:r>
-        <w:rPr>
-          <w:rFonts w:ascii="Comic Sans MS" w:hAnsi="Comic Sans MS" w:cs="Dreaming Outloud Pro"/>
-          <w:sz w:val="20"/>
-          <w:szCs w:val="20"/>
-        </w:rPr>
-        <w:t xml:space="preserve"> </w:t>
-      </w:r>
-      <w:r>
-        <w:rPr>
-          <w:rFonts w:ascii="Comic Sans MS" w:hAnsi="Comic Sans MS" w:cs="Dreaming Outloud Pro"/>
-          <w:sz w:val="20"/>
-          <w:szCs w:val="20"/>
-        </w:rPr>
         <w:t xml:space="preserve">WHICH PRESENTER ANNOUNCED HE WOULD BE QUITTING THE “HOUSE OF GAMES” SHOW AFTER </w:t>
       </w:r>
       <w:r>
@@ -582,22 +486,6 @@
           <w:sz w:val="20"/>
           <w:szCs w:val="20"/>
         </w:rPr>
-        <w:t>9</w:t>
-      </w:r>
-      <w:r>
-        <w:rPr>
-          <w:rFonts w:ascii="Comic Sans MS" w:hAnsi="Comic Sans MS" w:cs="Dreaming Outloud Pro"/>
-          <w:sz w:val="20"/>
-          <w:szCs w:val="20"/>
-        </w:rPr>
-        <w:t xml:space="preserve"> </w:t>
-      </w:r>
-      <w:r>
-        <w:rPr>
-          <w:rFonts w:ascii="Comic Sans MS" w:hAnsi="Comic Sans MS" w:cs="Dreaming Outloud Pro"/>
-          <w:sz w:val="20"/>
-          <w:szCs w:val="20"/>
-        </w:rPr>
         <w:t xml:space="preserve">THE HOME SECRETARY HAS </w:t>
       </w:r>
       <w:r>
@@ -647,22 +535,6 @@
           <w:sz w:val="20"/>
           <w:szCs w:val="20"/>
         </w:rPr>
-        <w:t>10</w:t>
-      </w:r>
-      <w:r>
-        <w:rPr>
-          <w:rFonts w:ascii="Comic Sans MS" w:hAnsi="Comic Sans MS" w:cs="Dreaming Outloud Pro"/>
-          <w:sz w:val="20"/>
-          <w:szCs w:val="20"/>
-        </w:rPr>
-        <w:t xml:space="preserve"> </w:t>
-      </w:r>
-      <w:r>
-        <w:rPr>
-          <w:rFonts w:ascii="Comic Sans MS" w:hAnsi="Comic Sans MS" w:cs="Dreaming Outloud Pro"/>
-          <w:sz w:val="20"/>
-          <w:szCs w:val="20"/>
-        </w:rPr>
         <w:t xml:space="preserve">THE OBR HAS WARNED THAT THE UK </w:t>
       </w:r>
       <w:r>
@@ -712,22 +584,6 @@
           <w:sz w:val="20"/>
           <w:szCs w:val="20"/>
         </w:rPr>
-        <w:t>1</w:t>
-      </w:r>
-      <w:r>
-        <w:rPr>
-          <w:rFonts w:ascii="Comic Sans MS" w:hAnsi="Comic Sans MS" w:cs="Dreaming Outloud Pro"/>
-          <w:sz w:val="20"/>
-          <w:szCs w:val="20"/>
-        </w:rPr>
-        <w:t xml:space="preserve"> </w:t>
-      </w:r>
-      <w:r>
-        <w:rPr>
-          <w:rFonts w:ascii="Comic Sans MS" w:hAnsi="Comic Sans MS" w:cs="Dreaming Outloud Pro"/>
-          <w:sz w:val="20"/>
-          <w:szCs w:val="20"/>
-        </w:rPr>
         <w:t>Geography:</w:t>
       </w:r>
       <w:r>
@@ -771,22 +627,6 @@
           <w:sz w:val="20"/>
           <w:szCs w:val="20"/>
         </w:rPr>
-        <w:t>2</w:t>
-      </w:r>
-      <w:r>
-        <w:rPr>
-          <w:rFonts w:ascii="Comic Sans MS" w:hAnsi="Comic Sans MS" w:cs="Dreaming Outloud Pro"/>
-          <w:sz w:val="20"/>
-          <w:szCs w:val="20"/>
-        </w:rPr>
-        <w:t xml:space="preserve"> </w:t>
-      </w:r>
-      <w:r>
-        <w:rPr>
-          <w:rFonts w:ascii="Comic Sans MS" w:hAnsi="Comic Sans MS" w:cs="Dreaming Outloud Pro"/>
-          <w:sz w:val="20"/>
-          <w:szCs w:val="20"/>
-        </w:rPr>
         <w:t>Entertainment</w:t>
       </w:r>
       <w:r>
@@ -830,22 +670,6 @@
           <w:sz w:val="20"/>
           <w:szCs w:val="20"/>
         </w:rPr>
-        <w:t>3</w:t>
-      </w:r>
-      <w:r>
-        <w:rPr>
-          <w:rFonts w:ascii="Comic Sans MS" w:hAnsi="Comic Sans MS" w:cs="Dreaming Outloud Pro"/>
-          <w:sz w:val="20"/>
-          <w:szCs w:val="20"/>
-        </w:rPr>
-        <w:t xml:space="preserve"> </w:t>
-      </w:r>
-      <w:r>
-        <w:rPr>
-          <w:rFonts w:ascii="Comic Sans MS" w:hAnsi="Comic Sans MS" w:cs="Dreaming Outloud Pro"/>
-          <w:sz w:val="20"/>
-          <w:szCs w:val="20"/>
-        </w:rPr>
         <w:t>History</w:t>
       </w:r>
       <w:r>
@@ -881,22 +705,6 @@
           <w:sz w:val="20"/>
           <w:szCs w:val="20"/>
         </w:rPr>
-        <w:t>4</w:t>
-      </w:r>
-      <w:r>
-        <w:rPr>
-          <w:rFonts w:ascii="Comic Sans MS" w:hAnsi="Comic Sans MS" w:cs="Dreaming Outloud Pro"/>
-          <w:sz w:val="20"/>
-          <w:szCs w:val="20"/>
-        </w:rPr>
-        <w:t xml:space="preserve"> </w:t>
-      </w:r>
-      <w:r>
-        <w:rPr>
-          <w:rFonts w:ascii="Comic Sans MS" w:hAnsi="Comic Sans MS" w:cs="Dreaming Outloud Pro"/>
-          <w:sz w:val="20"/>
-          <w:szCs w:val="20"/>
-        </w:rPr>
         <w:t>Art &amp; Literature</w:t>
       </w:r>
       <w:r>
@@ -942,22 +750,6 @@
           <w:szCs w:val="20"/>
         </w:rPr>
       </w:pPr>
-      <w:r>
-        <w:rPr>
-          <w:rFonts w:ascii="Comic Sans MS" w:hAnsi="Comic Sans MS" w:cs="Dreaming Outloud Pro"/>
-          <w:sz w:val="20"/>
-          <w:szCs w:val="20"/>
-        </w:rPr>
-        <w:t>5</w:t>
-      </w:r>
-      <w:r>
-        <w:rPr>
-          <w:rFonts w:ascii="Comic Sans MS" w:hAnsi="Comic Sans MS" w:cs="Dreaming Outloud Pro"/>
-          <w:sz w:val="20"/>
-          <w:szCs w:val="20"/>
-        </w:rPr>
-        <w:t xml:space="preserve"> </w:t>
-      </w:r>
       <w:r>
         <w:rPr>
           <w:rFonts w:ascii="Comic Sans MS" w:hAnsi="Comic Sans MS" w:cs="Dreaming Outloud Pro"/>
@@ -1008,22 +800,6 @@
           <w:sz w:val="20"/>
           <w:szCs w:val="20"/>
         </w:rPr>
-        <w:t>6</w:t>
-      </w:r>
-      <w:r>
-        <w:rPr>
-          <w:rFonts w:ascii="Comic Sans MS" w:hAnsi="Comic Sans MS" w:cs="Dreaming Outloud Pro"/>
-          <w:sz w:val="20"/>
-          <w:szCs w:val="20"/>
-        </w:rPr>
-        <w:t xml:space="preserve"> </w:t>
-      </w:r>
-      <w:r>
-        <w:rPr>
-          <w:rFonts w:ascii="Comic Sans MS" w:hAnsi="Comic Sans MS" w:cs="Dreaming Outloud Pro"/>
-          <w:sz w:val="20"/>
-          <w:szCs w:val="20"/>
-        </w:rPr>
         <w:t>Sport &amp; Leisure</w:t>
       </w:r>
       <w:r>
@@ -1101,6 +877,12 @@
         <w:rPr>
           <w:rFonts w:ascii="Comic Sans MS" w:hAnsi="Comic Sans MS"/>
         </w:rPr>
+        <w:t xml:space="preserve"> A</w:t>
+      </w:r>
+      <w:r>
+        <w:rPr>
+          <w:rFonts w:ascii="Comic Sans MS" w:hAnsi="Comic Sans MS"/>
+        </w:rPr>
         <w:t xml:space="preserve"> – Herd Mentality </w:t>
       </w:r>
     </w:p>
@@ -1119,14 +901,6 @@
           <w:sz w:val="20"/>
           <w:szCs w:val="20"/>
         </w:rPr>
-        <w:t xml:space="preserve">1 </w:t>
-      </w:r>
-      <w:r>
-        <w:rPr>
-          <w:rFonts w:ascii="Comic Sans MS" w:hAnsi="Comic Sans MS" w:cs="Dreaming Outloud Pro"/>
-          <w:sz w:val="20"/>
-          <w:szCs w:val="20"/>
-        </w:rPr>
         <w:t>NAME ANY MANAGER OF MANCHESTER UNITED SINCE 1945</w:t>
       </w:r>
       <w:r>
@@ -1153,7 +927,7 @@
           <w:sz w:val="20"/>
           <w:szCs w:val="20"/>
         </w:rPr>
-        <w:t>2 NAME ANY HOST CITY OF THE SUMMER OLYMPICS SINCE 1980</w:t>
+        <w:t>NAME ANY HOST CITY OF THE SUMMER OLYMPICS SINCE 1980</w:t>
       </w:r>
       <w:r>
         <w:rPr>
@@ -1179,7 +953,7 @@
           <w:sz w:val="20"/>
           <w:szCs w:val="20"/>
         </w:rPr>
-        <w:t>3 NAME ANY HOST CITY OF THE WINTER OLYMPICS SINCE 1980</w:t>
+        <w:t>NAME ANY HOST CITY OF THE WINTER OLYMPICS SINCE 1980</w:t>
       </w:r>
       <w:r>
         <w:rPr>
@@ -1205,7 +979,7 @@
           <w:sz w:val="20"/>
           <w:szCs w:val="20"/>
         </w:rPr>
-        <w:t>4 NAME ANY WINNER OF THE ACADEMY AWARD FOR BEST PICTURE SINCE 2000</w:t>
+        <w:t>NAME ANY WINNER OF THE ACADEMY AWARD FOR BEST PICTURE SINCE 2000</w:t>
       </w:r>
       <w:r>
         <w:rPr>
@@ -1231,7 +1005,7 @@
           <w:sz w:val="20"/>
           <w:szCs w:val="20"/>
         </w:rPr>
-        <w:t>5 NAME ANY MAIN CHARACTER (</w:t>
+        <w:t>NAME ANY MAIN CHARACTER (</w:t>
       </w:r>
       <w:r>
         <w:rPr>
@@ -1302,7 +1076,7 @@
           <w:sz w:val="32"/>
           <w:szCs w:val="40"/>
         </w:rPr>
-        <w:t xml:space="preserve"> – Limitless Wipeout</w:t>
+        <w:t xml:space="preserve"> </w:t>
       </w:r>
       <w:r>
         <w:rPr>
@@ -1311,158 +1085,17 @@
           <w:sz w:val="32"/>
           <w:szCs w:val="40"/>
         </w:rPr>
-        <w:t xml:space="preserve"> (Each answer is 50 or less) </w:t>
-      </w:r>
-    </w:p>
-    <w:p>
-      <w:pPr>
-        <w:ind w:left="142" w:hanging="142"/>
-        <w:jc w:val="both"/>
-        <w:rPr>
-          <w:rFonts w:ascii="Comic Sans MS" w:hAnsi="Comic Sans MS"/>
-        </w:rPr>
-      </w:pPr>
-      <w:r>
-        <w:rPr>
-          <w:rFonts w:ascii="Comic Sans MS" w:hAnsi="Comic Sans MS" w:cs="Dreaming Outloud Pro"/>
-          <w:sz w:val="20"/>
-          <w:szCs w:val="20"/>
-        </w:rPr>
-        <w:lastRenderedPageBreak/>
-        <w:t xml:space="preserve">6 </w:t>
-      </w:r>
-      <w:r>
-        <w:rPr>
-          <w:rFonts w:ascii="Comic Sans MS" w:hAnsi="Comic Sans MS" w:cs="Dreaming Outloud Pro"/>
-          <w:sz w:val="20"/>
-          <w:szCs w:val="20"/>
-        </w:rPr>
-        <w:t xml:space="preserve">IF PRINCE WILLIAM KEEPS HIS FIRST NAME WHEN BECOMING KING, WHAT WILL HIS REGNAL NUMBER BE? </w:t>
-      </w:r>
-    </w:p>
-    <w:p>
-      <w:pPr>
-        <w:ind w:left="142" w:hanging="142"/>
-        <w:jc w:val="both"/>
-        <w:rPr>
-          <w:rFonts w:ascii="Comic Sans MS" w:hAnsi="Comic Sans MS"/>
-        </w:rPr>
-      </w:pPr>
-      <w:r>
-        <w:rPr>
-          <w:rFonts w:ascii="Comic Sans MS" w:hAnsi="Comic Sans MS" w:cs="Dreaming Outloud Pro"/>
-          <w:sz w:val="20"/>
-          <w:szCs w:val="20"/>
-        </w:rPr>
-        <w:t xml:space="preserve">7 TO THE NEAREST MILE, HOW MANY MILES DOES 80 </w:t>
-      </w:r>
-      <w:r>
-        <w:rPr>
-          <w:rFonts w:ascii="Comic Sans MS" w:hAnsi="Comic Sans MS" w:cs="Dreaming Outloud Pro"/>
-          <w:sz w:val="20"/>
-          <w:szCs w:val="20"/>
-        </w:rPr>
-        <w:t>KILOMETRES</w:t>
-      </w:r>
-      <w:r>
-        <w:rPr>
-          <w:rFonts w:ascii="Comic Sans MS" w:hAnsi="Comic Sans MS" w:cs="Dreaming Outloud Pro"/>
-          <w:sz w:val="20"/>
-          <w:szCs w:val="20"/>
-        </w:rPr>
-        <w:t xml:space="preserve"> EQUATE TO? </w:t>
-      </w:r>
-    </w:p>
-    <w:p>
-      <w:pPr>
-        <w:ind w:left="142" w:hanging="142"/>
-        <w:jc w:val="both"/>
-        <w:rPr>
-          <w:rFonts w:ascii="Comic Sans MS" w:hAnsi="Comic Sans MS" w:cs="Dreaming Outloud Pro"/>
-          <w:sz w:val="20"/>
-          <w:szCs w:val="20"/>
-        </w:rPr>
-      </w:pPr>
-      <w:r>
-        <w:rPr>
-          <w:rFonts w:ascii="Comic Sans MS" w:hAnsi="Comic Sans MS" w:cs="Dreaming Outloud Pro"/>
-          <w:sz w:val="20"/>
-          <w:szCs w:val="20"/>
-        </w:rPr>
-        <w:t xml:space="preserve">8 </w:t>
-      </w:r>
-      <w:r>
-        <w:rPr>
-          <w:rFonts w:ascii="Comic Sans MS" w:hAnsi="Comic Sans MS" w:cs="Dreaming Outloud Pro"/>
-          <w:sz w:val="20"/>
-          <w:szCs w:val="20"/>
-        </w:rPr>
-        <w:t>HOW MANY TIME ZONES DOES RUSSIA HAVE?</w:t>
-      </w:r>
-      <w:r>
-        <w:rPr>
-          <w:rFonts w:ascii="Comic Sans MS" w:hAnsi="Comic Sans MS" w:cs="Dreaming Outloud Pro"/>
-          <w:sz w:val="20"/>
-          <w:szCs w:val="20"/>
-        </w:rPr>
-        <w:t xml:space="preserve"> </w:t>
-      </w:r>
-    </w:p>
-    <w:p>
-      <w:pPr>
-        <w:ind w:left="142" w:hanging="142"/>
-        <w:jc w:val="both"/>
-        <w:rPr>
-          <w:rFonts w:ascii="Comic Sans MS" w:hAnsi="Comic Sans MS" w:cs="Dreaming Outloud Pro"/>
-          <w:sz w:val="20"/>
-          <w:szCs w:val="20"/>
-        </w:rPr>
-      </w:pPr>
-      <w:r>
-        <w:rPr>
-          <w:rFonts w:ascii="Comic Sans MS" w:hAnsi="Comic Sans MS" w:cs="Dreaming Outloud Pro"/>
-          <w:sz w:val="20"/>
-          <w:szCs w:val="20"/>
-        </w:rPr>
-        <w:t>9 HOW MANY ACTORS HAVE PORTRAYED THE CHARACTER JACK RYAN IN TV SERIES OR FILMS</w:t>
-      </w:r>
-      <w:r>
-        <w:rPr>
-          <w:rFonts w:ascii="Comic Sans MS" w:hAnsi="Comic Sans MS" w:cs="Dreaming Outloud Pro"/>
-          <w:sz w:val="20"/>
-          <w:szCs w:val="20"/>
-        </w:rPr>
-        <w:t>?</w:t>
-      </w:r>
-    </w:p>
-    <w:p>
-      <w:pPr>
-        <w:ind w:left="142" w:hanging="142"/>
-        <w:jc w:val="both"/>
+        <w:t xml:space="preserve">B </w:t>
+      </w:r>
+      <w:r>
         <w:rPr>
           <w:rFonts w:ascii="Comic Sans MS" w:eastAsiaTheme="majorEastAsia" w:hAnsi="Comic Sans MS" w:cstheme="majorBidi"/>
           <w:color w:val="0F4761" w:themeColor="accent1" w:themeShade="BF"/>
           <w:sz w:val="32"/>
           <w:szCs w:val="40"/>
         </w:rPr>
-      </w:pPr>
-      <w:r>
-        <w:rPr>
-          <w:rFonts w:ascii="Comic Sans MS" w:hAnsi="Comic Sans MS" w:cs="Dreaming Outloud Pro"/>
-          <w:sz w:val="20"/>
-          <w:szCs w:val="20"/>
-        </w:rPr>
-        <w:t xml:space="preserve">10 WHAT YEAR WAS THE FIRST-GENERATION APPLE IPAD INTRODUCED (LAST TWO DIGITS OF THE YEAR) </w:t>
-      </w:r>
-    </w:p>
-    <w:p>
-      <w:pPr>
-        <w:ind w:left="142" w:hanging="142"/>
-        <w:jc w:val="both"/>
-        <w:rPr>
-          <w:rFonts w:ascii="Comic Sans MS" w:hAnsi="Comic Sans MS"/>
-        </w:rPr>
-      </w:pPr>
+        <w:t>– Limitless Wipeout</w:t>
+      </w:r>
       <w:r>
         <w:rPr>
           <w:rFonts w:ascii="Comic Sans MS" w:eastAsiaTheme="majorEastAsia" w:hAnsi="Comic Sans MS" w:cstheme="majorBidi"/>
@@ -1470,17 +1103,142 @@
           <w:sz w:val="32"/>
           <w:szCs w:val="40"/>
         </w:rPr>
-        <w:t xml:space="preserve">ROUND </w:t>
-      </w:r>
-      <w:r>
+        <w:t xml:space="preserve"> (Each answer is 50 or less) </w:t>
+      </w:r>
+    </w:p>
+    <w:p>
+      <w:pPr>
+        <w:ind w:left="142" w:hanging="142"/>
+        <w:jc w:val="both"/>
+        <w:rPr>
+          <w:rFonts w:ascii="Comic Sans MS" w:hAnsi="Comic Sans MS"/>
+        </w:rPr>
+      </w:pPr>
+      <w:r>
+        <w:rPr>
+          <w:rFonts w:ascii="Comic Sans MS" w:hAnsi="Comic Sans MS" w:cs="Dreaming Outloud Pro"/>
+          <w:sz w:val="20"/>
+          <w:szCs w:val="20"/>
+        </w:rPr>
+        <w:lastRenderedPageBreak/>
+        <w:t xml:space="preserve">IF PRINCE WILLIAM KEEPS HIS FIRST NAME WHEN BECOMING KING, WHAT WILL HIS REGNAL NUMBER BE? </w:t>
+      </w:r>
+    </w:p>
+    <w:p>
+      <w:pPr>
+        <w:ind w:left="142" w:hanging="142"/>
+        <w:jc w:val="both"/>
+        <w:rPr>
+          <w:rFonts w:ascii="Comic Sans MS" w:hAnsi="Comic Sans MS"/>
+        </w:rPr>
+      </w:pPr>
+      <w:r>
+        <w:rPr>
+          <w:rFonts w:ascii="Comic Sans MS" w:hAnsi="Comic Sans MS" w:cs="Dreaming Outloud Pro"/>
+          <w:sz w:val="20"/>
+          <w:szCs w:val="20"/>
+        </w:rPr>
+        <w:t xml:space="preserve">TO THE NEAREST MILE, HOW MANY MILES DOES 80 </w:t>
+      </w:r>
+      <w:r>
+        <w:rPr>
+          <w:rFonts w:ascii="Comic Sans MS" w:hAnsi="Comic Sans MS" w:cs="Dreaming Outloud Pro"/>
+          <w:sz w:val="20"/>
+          <w:szCs w:val="20"/>
+        </w:rPr>
+        <w:t>KILOMETRES</w:t>
+      </w:r>
+      <w:r>
+        <w:rPr>
+          <w:rFonts w:ascii="Comic Sans MS" w:hAnsi="Comic Sans MS" w:cs="Dreaming Outloud Pro"/>
+          <w:sz w:val="20"/>
+          <w:szCs w:val="20"/>
+        </w:rPr>
+        <w:t xml:space="preserve"> EQUATE TO? </w:t>
+      </w:r>
+    </w:p>
+    <w:p>
+      <w:pPr>
+        <w:ind w:left="142" w:hanging="142"/>
+        <w:jc w:val="both"/>
+        <w:rPr>
+          <w:rFonts w:ascii="Comic Sans MS" w:hAnsi="Comic Sans MS" w:cs="Dreaming Outloud Pro"/>
+          <w:sz w:val="20"/>
+          <w:szCs w:val="20"/>
+        </w:rPr>
+      </w:pPr>
+      <w:r>
+        <w:rPr>
+          <w:rFonts w:ascii="Comic Sans MS" w:hAnsi="Comic Sans MS" w:cs="Dreaming Outloud Pro"/>
+          <w:sz w:val="20"/>
+          <w:szCs w:val="20"/>
+        </w:rPr>
+        <w:t>HOW MANY TIME ZONES DOES RUSSIA HAVE?</w:t>
+      </w:r>
+      <w:r>
+        <w:rPr>
+          <w:rFonts w:ascii="Comic Sans MS" w:hAnsi="Comic Sans MS" w:cs="Dreaming Outloud Pro"/>
+          <w:sz w:val="20"/>
+          <w:szCs w:val="20"/>
+        </w:rPr>
+        <w:t xml:space="preserve"> </w:t>
+      </w:r>
+    </w:p>
+    <w:p>
+      <w:pPr>
+        <w:ind w:left="142" w:hanging="142"/>
+        <w:jc w:val="both"/>
+        <w:rPr>
+          <w:rFonts w:ascii="Comic Sans MS" w:hAnsi="Comic Sans MS" w:cs="Dreaming Outloud Pro"/>
+          <w:sz w:val="20"/>
+          <w:szCs w:val="20"/>
+        </w:rPr>
+      </w:pPr>
+      <w:r>
+        <w:rPr>
+          <w:rFonts w:ascii="Comic Sans MS" w:hAnsi="Comic Sans MS" w:cs="Dreaming Outloud Pro"/>
+          <w:sz w:val="20"/>
+          <w:szCs w:val="20"/>
+        </w:rPr>
+        <w:t>HOW MANY ACTORS HAVE PORTRAYED THE CHARACTER JACK RYAN IN TV SERIES OR FILMS</w:t>
+      </w:r>
+      <w:r>
+        <w:rPr>
+          <w:rFonts w:ascii="Comic Sans MS" w:hAnsi="Comic Sans MS" w:cs="Dreaming Outloud Pro"/>
+          <w:sz w:val="20"/>
+          <w:szCs w:val="20"/>
+        </w:rPr>
+        <w:t>?</w:t>
+      </w:r>
+    </w:p>
+    <w:p>
+      <w:pPr>
+        <w:ind w:left="142" w:hanging="142"/>
+        <w:jc w:val="both"/>
         <w:rPr>
           <w:rFonts w:ascii="Comic Sans MS" w:eastAsiaTheme="majorEastAsia" w:hAnsi="Comic Sans MS" w:cstheme="majorBidi"/>
           <w:color w:val="0F4761" w:themeColor="accent1" w:themeShade="BF"/>
           <w:sz w:val="32"/>
           <w:szCs w:val="40"/>
         </w:rPr>
-        <w:t>FOUR</w:t>
-      </w:r>
+      </w:pPr>
+      <w:r>
+        <w:rPr>
+          <w:rFonts w:ascii="Comic Sans MS" w:hAnsi="Comic Sans MS" w:cs="Dreaming Outloud Pro"/>
+          <w:sz w:val="20"/>
+          <w:szCs w:val="20"/>
+        </w:rPr>
+        <w:t xml:space="preserve">WHAT YEAR WAS THE FIRST-GENERATION APPLE IPAD INTRODUCED (LAST TWO DIGITS OF THE YEAR) </w:t>
+      </w:r>
+    </w:p>
+    <w:p>
+      <w:pPr>
+        <w:ind w:left="142" w:hanging="142"/>
+        <w:jc w:val="both"/>
+        <w:rPr>
+          <w:rFonts w:ascii="Comic Sans MS" w:hAnsi="Comic Sans MS"/>
+        </w:rPr>
+      </w:pPr>
       <w:r>
         <w:rPr>
           <w:rFonts w:ascii="Comic Sans MS" w:eastAsiaTheme="majorEastAsia" w:hAnsi="Comic Sans MS" w:cstheme="majorBidi"/>
@@ -1488,7 +1246,7 @@
           <w:sz w:val="32"/>
           <w:szCs w:val="40"/>
         </w:rPr>
-        <w:t xml:space="preserve"> </w:t>
+        <w:t xml:space="preserve">ROUND </w:t>
       </w:r>
       <w:r>
         <w:rPr>
@@ -1497,7 +1255,7 @@
           <w:sz w:val="32"/>
           <w:szCs w:val="40"/>
         </w:rPr>
-        <w:t>–</w:t>
+        <w:t>FOUR</w:t>
       </w:r>
       <w:r>
         <w:rPr>
@@ -1515,7 +1273,7 @@
           <w:sz w:val="32"/>
           <w:szCs w:val="40"/>
         </w:rPr>
-        <w:t xml:space="preserve">WHO AM </w:t>
+        <w:t>–</w:t>
       </w:r>
       <w:r>
         <w:rPr>
@@ -1524,6 +1282,24 @@
           <w:sz w:val="32"/>
           <w:szCs w:val="40"/>
         </w:rPr>
+        <w:t xml:space="preserve"> </w:t>
+      </w:r>
+      <w:r>
+        <w:rPr>
+          <w:rFonts w:ascii="Comic Sans MS" w:eastAsiaTheme="majorEastAsia" w:hAnsi="Comic Sans MS" w:cstheme="majorBidi"/>
+          <w:color w:val="0F4761" w:themeColor="accent1" w:themeShade="BF"/>
+          <w:sz w:val="32"/>
+          <w:szCs w:val="40"/>
+        </w:rPr>
+        <w:t xml:space="preserve">WHO AM </w:t>
+      </w:r>
+      <w:r>
+        <w:rPr>
+          <w:rFonts w:ascii="Comic Sans MS" w:eastAsiaTheme="majorEastAsia" w:hAnsi="Comic Sans MS" w:cstheme="majorBidi"/>
+          <w:color w:val="0F4761" w:themeColor="accent1" w:themeShade="BF"/>
+          <w:sz w:val="32"/>
+          <w:szCs w:val="40"/>
+        </w:rPr>
         <w:t>I?</w:t>
       </w:r>
       <w:r>
@@ -1549,22 +1325,6 @@
           <w:sz w:val="20"/>
           <w:szCs w:val="20"/>
         </w:rPr>
-        <w:t>10</w:t>
-      </w:r>
-      <w:r>
-        <w:rPr>
-          <w:rFonts w:ascii="Comic Sans MS" w:hAnsi="Comic Sans MS" w:cs="Dreaming Outloud Pro"/>
-          <w:sz w:val="20"/>
-          <w:szCs w:val="20"/>
-        </w:rPr>
-        <w:t xml:space="preserve"> </w:t>
-      </w:r>
-      <w:r>
-        <w:rPr>
-          <w:rFonts w:ascii="Comic Sans MS" w:hAnsi="Comic Sans MS" w:cs="Dreaming Outloud Pro"/>
-          <w:sz w:val="20"/>
-          <w:szCs w:val="20"/>
-        </w:rPr>
         <w:t>I WAS BORN IN WALES IN 1968.  MY MIDDLE NAME IS DANIEL</w:t>
       </w:r>
       <w:r>
@@ -1608,22 +1368,6 @@
           <w:sz w:val="20"/>
           <w:szCs w:val="20"/>
         </w:rPr>
-        <w:t>8</w:t>
-      </w:r>
-      <w:r>
-        <w:rPr>
-          <w:rFonts w:ascii="Comic Sans MS" w:hAnsi="Comic Sans MS" w:cs="Dreaming Outloud Pro"/>
-          <w:sz w:val="20"/>
-          <w:szCs w:val="20"/>
-        </w:rPr>
-        <w:t xml:space="preserve"> </w:t>
-      </w:r>
-      <w:r>
-        <w:rPr>
-          <w:rFonts w:ascii="Comic Sans MS" w:hAnsi="Comic Sans MS" w:cs="Dreaming Outloud Pro"/>
-          <w:sz w:val="20"/>
-          <w:szCs w:val="20"/>
-        </w:rPr>
         <w:t>I</w:t>
       </w:r>
       <w:r>
@@ -1796,22 +1540,6 @@
           <w:sz w:val="20"/>
           <w:szCs w:val="20"/>
         </w:rPr>
-        <w:t>6</w:t>
-      </w:r>
-      <w:r>
-        <w:rPr>
-          <w:rFonts w:ascii="Comic Sans MS" w:hAnsi="Comic Sans MS" w:cs="Dreaming Outloud Pro"/>
-          <w:sz w:val="20"/>
-          <w:szCs w:val="20"/>
-        </w:rPr>
-        <w:t xml:space="preserve"> </w:t>
-      </w:r>
-      <w:r>
-        <w:rPr>
-          <w:rFonts w:ascii="Comic Sans MS" w:hAnsi="Comic Sans MS" w:cs="Dreaming Outloud Pro"/>
-          <w:sz w:val="20"/>
-          <w:szCs w:val="20"/>
-        </w:rPr>
         <w:t>BEFORE ENTERING COMEDY FULL-TIME IN MY 30</w:t>
       </w:r>
       <w:r>
@@ -1920,22 +1648,6 @@
           <w:sz w:val="20"/>
           <w:szCs w:val="20"/>
         </w:rPr>
-        <w:t>4</w:t>
-      </w:r>
-      <w:r>
-        <w:rPr>
-          <w:rFonts w:ascii="Comic Sans MS" w:hAnsi="Comic Sans MS" w:cs="Dreaming Outloud Pro"/>
-          <w:sz w:val="20"/>
-          <w:szCs w:val="20"/>
-        </w:rPr>
-        <w:t xml:space="preserve"> </w:t>
-      </w:r>
-      <w:r>
-        <w:rPr>
-          <w:rFonts w:ascii="Comic Sans MS" w:hAnsi="Comic Sans MS" w:cs="Dreaming Outloud Pro"/>
-          <w:sz w:val="20"/>
-          <w:szCs w:val="20"/>
-        </w:rPr>
         <w:t xml:space="preserve">MY MAINSTREAM ACTING BREAKTHROUGH CAME WHEN I WAS CAST AS THE </w:t>
       </w:r>
       <w:r>
@@ -2062,7 +1774,7 @@
           <w:sz w:val="20"/>
           <w:szCs w:val="20"/>
         </w:rPr>
-        <w:t xml:space="preserve"> STARRING ALONGSIDE ADAM SAMBERG &amp; TAYLOR LAUTNER.</w:t>
+        <w:t xml:space="preserve"> STARRING LONGSIDE ADAM SAMBERG &amp; TAYLOR LAUTNER.</w:t>
       </w:r>
     </w:p>
     <w:p>
@@ -2080,22 +1792,6 @@
           <w:sz w:val="20"/>
           <w:szCs w:val="20"/>
         </w:rPr>
-        <w:t>2</w:t>
-      </w:r>
-      <w:r>
-        <w:rPr>
-          <w:rFonts w:ascii="Comic Sans MS" w:hAnsi="Comic Sans MS" w:cs="Dreaming Outloud Pro"/>
-          <w:sz w:val="20"/>
-          <w:szCs w:val="20"/>
-        </w:rPr>
-        <w:t xml:space="preserve"> </w:t>
-      </w:r>
-      <w:r>
-        <w:rPr>
-          <w:rFonts w:ascii="Comic Sans MS" w:hAnsi="Comic Sans MS" w:cs="Dreaming Outloud Pro"/>
-          <w:sz w:val="20"/>
-          <w:szCs w:val="20"/>
-        </w:rPr>
         <w:t>I AM MOST FAMOUS FOR MY ROLE AS THE "ALL-POWERFUL" JUDGE ON LONG-RUNNING DAVE/CHANNEL 4 SERIES</w:t>
       </w:r>
       <w:r>
@@ -2173,22 +1869,6 @@
           <w:sz w:val="20"/>
           <w:szCs w:val="20"/>
         </w:rPr>
-        <w:t>1</w:t>
-      </w:r>
-      <w:r>
-        <w:rPr>
-          <w:rFonts w:ascii="Comic Sans MS" w:hAnsi="Comic Sans MS" w:cs="Dreaming Outloud Pro"/>
-          <w:sz w:val="20"/>
-          <w:szCs w:val="20"/>
-        </w:rPr>
-        <w:t xml:space="preserve"> </w:t>
-      </w:r>
-      <w:r>
-        <w:rPr>
-          <w:rFonts w:ascii="Comic Sans MS" w:hAnsi="Comic Sans MS" w:cs="Dreaming Outloud Pro"/>
-          <w:sz w:val="20"/>
-          <w:szCs w:val="20"/>
-        </w:rPr>
         <w:t xml:space="preserve">WHAT IS THE NAME GIVEN TO A MINI HOME ON WHEELS TOWED BEHIND A </w:t>
       </w:r>
       <w:r>
@@ -2240,14 +1920,6 @@
           <w:sz w:val="20"/>
           <w:szCs w:val="20"/>
         </w:rPr>
-        <w:t xml:space="preserve">2 </w:t>
-      </w:r>
-      <w:r>
-        <w:rPr>
-          <w:rFonts w:ascii="Comic Sans MS" w:hAnsi="Comic Sans MS" w:cs="Dreaming Outloud Pro"/>
-          <w:sz w:val="20"/>
-          <w:szCs w:val="20"/>
-        </w:rPr>
         <w:t>WHAT IS THE NAME GIVEN TO A CALENDAR YEAR THAT CONTAINS AN EXTRA DAY</w:t>
       </w:r>
       <w:r>
@@ -2275,22 +1947,6 @@
           <w:sz w:val="20"/>
           <w:szCs w:val="20"/>
         </w:rPr>
-        <w:t>3</w:t>
-      </w:r>
-      <w:r>
-        <w:rPr>
-          <w:rFonts w:ascii="Comic Sans MS" w:hAnsi="Comic Sans MS" w:cs="Dreaming Outloud Pro"/>
-          <w:sz w:val="20"/>
-          <w:szCs w:val="20"/>
-        </w:rPr>
-        <w:t xml:space="preserve"> </w:t>
-      </w:r>
-      <w:r>
-        <w:rPr>
-          <w:rFonts w:ascii="Comic Sans MS" w:hAnsi="Comic Sans MS" w:cs="Dreaming Outloud Pro"/>
-          <w:sz w:val="20"/>
-          <w:szCs w:val="20"/>
-        </w:rPr>
         <w:t>WHAT IS THE NAME OF THE HISTORIC CASTLE ON THE NORTH BANK OF THE RIVER THAMES</w:t>
       </w:r>
       <w:r>
@@ -2318,15 +1974,7 @@
           <w:sz w:val="20"/>
           <w:szCs w:val="20"/>
         </w:rPr>
-        <w:t>4</w:t>
-      </w:r>
-      <w:r>
-        <w:rPr>
-          <w:rFonts w:ascii="Comic Sans MS" w:hAnsi="Comic Sans MS" w:cs="Dreaming Outloud Pro"/>
-          <w:sz w:val="20"/>
-          <w:szCs w:val="20"/>
-        </w:rPr>
-        <w:t xml:space="preserve"> WHAT IS THE NAME</w:t>
+        <w:t>WHAT IS THE NAME</w:t>
       </w:r>
       <w:r>
         <w:rPr>
@@ -2435,55 +2083,25 @@
     </w:p>
     <w:p>
       <w:r>
-        <w:t>1</w:t>
-      </w:r>
-      <w:r>
-        <w:t xml:space="preserve"> </w:t>
-      </w:r>
-      <w:r>
         <w:t xml:space="preserve">REAL </w:t>
       </w:r>
     </w:p>
     <w:p>
       <w:r>
-        <w:t>2</w:t>
-      </w:r>
-      <w:r>
-        <w:t xml:space="preserve"> </w:t>
-      </w:r>
-      <w:r>
         <w:t xml:space="preserve">RUPEE </w:t>
       </w:r>
     </w:p>
     <w:p>
       <w:r>
-        <w:t>3</w:t>
-      </w:r>
-      <w:r>
-        <w:t xml:space="preserve"> </w:t>
-      </w:r>
-      <w:r>
         <w:t xml:space="preserve">KRONE </w:t>
       </w:r>
     </w:p>
     <w:p>
       <w:r>
-        <w:t>4</w:t>
-      </w:r>
-      <w:r>
-        <w:t xml:space="preserve"> </w:t>
-      </w:r>
-      <w:r>
         <w:t xml:space="preserve">WON </w:t>
       </w:r>
     </w:p>
     <w:p>
-      <w:r>
-        <w:t>5</w:t>
-      </w:r>
-      <w:r>
-        <w:t xml:space="preserve"> </w:t>
-      </w:r>
       <w:r>
         <w:t xml:space="preserve">BAHT </w:t>
       </w:r>
@@ -2541,46 +2159,28 @@
     </w:p>
     <w:p>
       <w:r>
-        <w:t>1</w:t>
+        <w:t>IN WHICH SPORT WOULD YOU</w:t>
+      </w:r>
+      <w:r>
+        <w:t xml:space="preserve"> THROW STONES AT HOUSES? </w:t>
+      </w:r>
+    </w:p>
+    <w:p>
+      <w:r>
+        <w:t>IN WHICH SPORT WOULD YOU</w:t>
+      </w:r>
+      <w:r>
+        <w:t xml:space="preserve"> STAND AT SILLY POINT? </w:t>
+      </w:r>
+    </w:p>
+    <w:p>
+      <w:r>
+        <w:t>IN WHICH SPORT WOULD YOU</w:t>
       </w:r>
       <w:r>
         <w:t xml:space="preserve"> </w:t>
       </w:r>
       <w:r>
-        <w:t>IN WHICH SPORT WOULD YOU</w:t>
-      </w:r>
-      <w:r>
-        <w:t xml:space="preserve"> THROW STONES AT HOUSES? </w:t>
-      </w:r>
-    </w:p>
-    <w:p>
-      <w:r>
-        <w:t>2</w:t>
-      </w:r>
-      <w:r>
-        <w:t xml:space="preserve"> </w:t>
-      </w:r>
-      <w:r>
-        <w:t>IN WHICH SPORT WOULD YOU</w:t>
-      </w:r>
-      <w:r>
-        <w:t xml:space="preserve"> STAND AT SILLY POINT? </w:t>
-      </w:r>
-    </w:p>
-    <w:p>
-      <w:r>
-        <w:t>3</w:t>
-      </w:r>
-      <w:r>
-        <w:t xml:space="preserve"> </w:t>
-      </w:r>
-      <w:r>
-        <w:t>IN WHICH SPORT WOULD YOU</w:t>
-      </w:r>
-      <w:r>
-        <w:t xml:space="preserve"> </w:t>
-      </w:r>
-      <w:r>
         <w:t>START AT SOUTH STAKE</w:t>
       </w:r>
       <w:r>
@@ -2588,12 +2188,6 @@
       </w:r>
     </w:p>
     <w:p>
-      <w:r>
-        <w:t>4</w:t>
-      </w:r>
-      <w:r>
-        <w:t xml:space="preserve"> </w:t>
-      </w:r>
       <w:r>
         <w:t>IN WHICH SPORT WOULD YOU</w:t>
       </w:r>
@@ -2614,13 +2208,10 @@
         </w:rPr>
       </w:pPr>
       <w:r>
-        <w:t>5</w:t>
-      </w:r>
-      <w:r>
-        <w:t xml:space="preserve"> </w:t>
-      </w:r>
-      <w:r>
-        <w:t xml:space="preserve">IN WHICH SPORT WOULD YOU SCORE A TURKEY? </w:t>
+        <w:t>I</w:t>
+      </w:r>
+      <w:r>
+        <w:t xml:space="preserve">N WHICH SPORT WOULD YOU SCORE A TURKEY? </w:t>
       </w:r>
     </w:p>
     <w:sectPr>

</xml_diff>